<commit_message>
Update/ 1.2.0 Version. Deliverable code and backlog update.
</commit_message>
<xml_diff>
--- a/Backlog.docx
+++ b/Backlog.docx
@@ -127,24 +127,6 @@
           <w:lang w:val="en-US"/>
         </w:rPr>
       </w:pPr>
-      <w:r>
-        <w:rPr>
-          <w:lang w:val="en-US"/>
-        </w:rPr>
-        <w:t xml:space="preserve">Sprint </w:t>
-      </w:r>
-      <w:r>
-        <w:rPr>
-          <w:lang w:val="en-US"/>
-        </w:rPr>
-        <w:t>3</w:t>
-      </w:r>
-      <w:r>
-        <w:rPr>
-          <w:lang w:val="en-US"/>
-        </w:rPr>
-        <w:t xml:space="preserve">. </w:t>
-      </w:r>
       <w:r>
         <w:rPr>
           <w:lang w:val="en-US"/>
@@ -1363,7 +1345,7 @@
               <w:rPr>
                 <w:lang w:val="en-US"/>
               </w:rPr>
-              <w:t>TBD</w:t>
+              <w:t xml:space="preserve">Determine </w:t>
             </w:r>
           </w:p>
         </w:tc>
@@ -1781,6 +1763,24 @@
               <w:t>-Repository link</w:t>
             </w:r>
           </w:p>
+          <w:p>
+            <w:pPr>
+              <w:cnfStyle w:val="000000100000" w:firstRow="0" w:lastRow="0" w:firstColumn="0" w:lastColumn="0" w:oddVBand="0" w:evenVBand="0" w:oddHBand="1" w:evenHBand="0" w:firstRowFirstColumn="0" w:firstRowLastColumn="0" w:lastRowFirstColumn="0" w:lastRowLastColumn="0"/>
+              <w:rPr>
+                <w:sz w:val="22"/>
+                <w:szCs w:val="22"/>
+                <w:lang w:val="en-US"/>
+              </w:rPr>
+            </w:pPr>
+            <w:r>
+              <w:rPr>
+                <w:sz w:val="22"/>
+                <w:szCs w:val="22"/>
+                <w:lang w:val="en-US"/>
+              </w:rPr>
+              <w:t>-Documental presentation</w:t>
+            </w:r>
+          </w:p>
         </w:tc>
       </w:tr>
       <w:tr>
@@ -1891,6 +1891,24 @@
                 <w:lang w:val="en-US"/>
               </w:rPr>
               <w:t>-Repository link</w:t>
+            </w:r>
+          </w:p>
+          <w:p>
+            <w:pPr>
+              <w:cnfStyle w:val="000000000000" w:firstRow="0" w:lastRow="0" w:firstColumn="0" w:lastColumn="0" w:oddVBand="0" w:evenVBand="0" w:oddHBand="0" w:evenHBand="0" w:firstRowFirstColumn="0" w:firstRowLastColumn="0" w:lastRowFirstColumn="0" w:lastRowLastColumn="0"/>
+              <w:rPr>
+                <w:sz w:val="22"/>
+                <w:szCs w:val="22"/>
+                <w:lang w:val="en-US"/>
+              </w:rPr>
+            </w:pPr>
+            <w:r>
+              <w:rPr>
+                <w:sz w:val="22"/>
+                <w:szCs w:val="22"/>
+                <w:lang w:val="en-US"/>
+              </w:rPr>
+              <w:t>-Documental presentation</w:t>
             </w:r>
           </w:p>
         </w:tc>
@@ -2010,6 +2028,24 @@
               <w:t>-Repository link</w:t>
             </w:r>
           </w:p>
+          <w:p>
+            <w:pPr>
+              <w:cnfStyle w:val="000000100000" w:firstRow="0" w:lastRow="0" w:firstColumn="0" w:lastColumn="0" w:oddVBand="0" w:evenVBand="0" w:oddHBand="1" w:evenHBand="0" w:firstRowFirstColumn="0" w:firstRowLastColumn="0" w:lastRowFirstColumn="0" w:lastRowLastColumn="0"/>
+              <w:rPr>
+                <w:sz w:val="22"/>
+                <w:szCs w:val="22"/>
+                <w:lang w:val="en-US"/>
+              </w:rPr>
+            </w:pPr>
+            <w:r>
+              <w:rPr>
+                <w:sz w:val="22"/>
+                <w:szCs w:val="22"/>
+                <w:lang w:val="en-US"/>
+              </w:rPr>
+              <w:t>-Documental presentation</w:t>
+            </w:r>
+          </w:p>
         </w:tc>
       </w:tr>
       <w:tr>
@@ -2120,6 +2156,24 @@
                 <w:lang w:val="en-US"/>
               </w:rPr>
               <w:t>-Repository link</w:t>
+            </w:r>
+          </w:p>
+          <w:p>
+            <w:pPr>
+              <w:cnfStyle w:val="000000000000" w:firstRow="0" w:lastRow="0" w:firstColumn="0" w:lastColumn="0" w:oddVBand="0" w:evenVBand="0" w:oddHBand="0" w:evenHBand="0" w:firstRowFirstColumn="0" w:firstRowLastColumn="0" w:lastRowFirstColumn="0" w:lastRowLastColumn="0"/>
+              <w:rPr>
+                <w:sz w:val="22"/>
+                <w:szCs w:val="22"/>
+                <w:lang w:val="en-US"/>
+              </w:rPr>
+            </w:pPr>
+            <w:r>
+              <w:rPr>
+                <w:sz w:val="22"/>
+                <w:szCs w:val="22"/>
+                <w:lang w:val="en-US"/>
+              </w:rPr>
+              <w:t>-Documental presentation</w:t>
             </w:r>
           </w:p>
         </w:tc>
@@ -2959,6 +3013,24 @@
               <w:t>-Repository link</w:t>
             </w:r>
           </w:p>
+          <w:p>
+            <w:pPr>
+              <w:cnfStyle w:val="000000000000" w:firstRow="0" w:lastRow="0" w:firstColumn="0" w:lastColumn="0" w:oddVBand="0" w:evenVBand="0" w:oddHBand="0" w:evenHBand="0" w:firstRowFirstColumn="0" w:firstRowLastColumn="0" w:lastRowFirstColumn="0" w:lastRowLastColumn="0"/>
+              <w:rPr>
+                <w:sz w:val="22"/>
+                <w:szCs w:val="22"/>
+                <w:lang w:val="en-US"/>
+              </w:rPr>
+            </w:pPr>
+            <w:r>
+              <w:rPr>
+                <w:sz w:val="22"/>
+                <w:szCs w:val="22"/>
+                <w:lang w:val="en-US"/>
+              </w:rPr>
+              <w:t>- Java Program</w:t>
+            </w:r>
+          </w:p>
         </w:tc>
       </w:tr>
       <w:tr>
@@ -2984,7 +3056,23 @@
                 <w:szCs w:val="22"/>
                 <w:lang w:val="en-US"/>
               </w:rPr>
-              <w:t>Create a class to write CSV files.</w:t>
+              <w:t xml:space="preserve">Create a class to </w:t>
+            </w:r>
+            <w:r>
+              <w:rPr>
+                <w:sz w:val="22"/>
+                <w:szCs w:val="22"/>
+                <w:lang w:val="en-US"/>
+              </w:rPr>
+              <w:t>flatten</w:t>
+            </w:r>
+            <w:r>
+              <w:rPr>
+                <w:sz w:val="22"/>
+                <w:szCs w:val="22"/>
+                <w:lang w:val="en-US"/>
+              </w:rPr>
+              <w:t xml:space="preserve"> JSON files.</w:t>
             </w:r>
           </w:p>
         </w:tc>
@@ -3033,7 +3121,7 @@
                 <w:szCs w:val="22"/>
                 <w:lang w:val="en-US"/>
               </w:rPr>
-              <w:t>write a CSV file based of the JSON file’s parsed content.</w:t>
+              <w:t>flatten parsed content from JSON files</w:t>
             </w:r>
           </w:p>
         </w:tc>
@@ -3080,6 +3168,24 @@
                 <w:lang w:val="en-US"/>
               </w:rPr>
               <w:t>-Repository link</w:t>
+            </w:r>
+          </w:p>
+          <w:p>
+            <w:pPr>
+              <w:cnfStyle w:val="000000100000" w:firstRow="0" w:lastRow="0" w:firstColumn="0" w:lastColumn="0" w:oddVBand="0" w:evenVBand="0" w:oddHBand="1" w:evenHBand="0" w:firstRowFirstColumn="0" w:firstRowLastColumn="0" w:lastRowFirstColumn="0" w:lastRowLastColumn="0"/>
+              <w:rPr>
+                <w:sz w:val="22"/>
+                <w:szCs w:val="22"/>
+                <w:lang w:val="en-US"/>
+              </w:rPr>
+            </w:pPr>
+            <w:r>
+              <w:rPr>
+                <w:sz w:val="22"/>
+                <w:szCs w:val="22"/>
+                <w:lang w:val="en-US"/>
+              </w:rPr>
+              <w:t>- Java Program</w:t>
             </w:r>
           </w:p>
         </w:tc>
@@ -3104,7 +3210,7 @@
                 <w:szCs w:val="22"/>
                 <w:lang w:val="en-US"/>
               </w:rPr>
-              <w:t>Create a class to convert files.</w:t>
+              <w:t>Create a class to write CSV files.</w:t>
             </w:r>
           </w:p>
         </w:tc>
@@ -3127,7 +3233,7 @@
                 <w:szCs w:val="22"/>
                 <w:lang w:val="en-US"/>
               </w:rPr>
-              <w:t>-Stablish the main class for the program.</w:t>
+              <w:t>-Determine functions from the library used needed.</w:t>
             </w:r>
           </w:p>
           <w:p>
@@ -3145,9 +3251,30 @@
                 <w:szCs w:val="22"/>
                 <w:lang w:val="en-US"/>
               </w:rPr>
-              <w:t>-Call both classes methods.</w:t>
-            </w:r>
-          </w:p>
+              <w:t xml:space="preserve">-Use functions to write a CSV file based of the JSON file’s parsed </w:t>
+            </w:r>
+            <w:r>
+              <w:rPr>
+                <w:sz w:val="22"/>
+                <w:szCs w:val="22"/>
+                <w:lang w:val="en-US"/>
+              </w:rPr>
+              <w:t xml:space="preserve">and flattened </w:t>
+            </w:r>
+            <w:r>
+              <w:rPr>
+                <w:sz w:val="22"/>
+                <w:szCs w:val="22"/>
+                <w:lang w:val="en-US"/>
+              </w:rPr>
+              <w:t>content.</w:t>
+            </w:r>
+          </w:p>
+        </w:tc>
+        <w:tc>
+          <w:tcPr>
+            <w:tcW w:w="2385" w:type="dxa"/>
+          </w:tcPr>
           <w:p>
             <w:pPr>
               <w:cnfStyle w:val="000000000000" w:firstRow="0" w:lastRow="0" w:firstColumn="0" w:lastColumn="0" w:oddVBand="0" w:evenVBand="0" w:oddHBand="0" w:evenHBand="0" w:firstRowFirstColumn="0" w:firstRowLastColumn="0" w:lastRowFirstColumn="0" w:lastRowLastColumn="0"/>
@@ -3163,13 +3290,13 @@
                 <w:szCs w:val="22"/>
                 <w:lang w:val="en-US"/>
               </w:rPr>
-              <w:t>-Stablish inputs and outputs to handle the program.</w:t>
-            </w:r>
-          </w:p>
-        </w:tc>
-        <w:tc>
-          <w:tcPr>
-            <w:tcW w:w="2385" w:type="dxa"/>
+              <w:t>09/21/2025 (4 days)</w:t>
+            </w:r>
+          </w:p>
+        </w:tc>
+        <w:tc>
+          <w:tcPr>
+            <w:tcW w:w="2029" w:type="dxa"/>
           </w:tcPr>
           <w:p>
             <w:pPr>
@@ -3186,14 +3313,9 @@
                 <w:szCs w:val="22"/>
                 <w:lang w:val="en-US"/>
               </w:rPr>
-              <w:t>09/25/2025 (4 days)</w:t>
-            </w:r>
-          </w:p>
-        </w:tc>
-        <w:tc>
-          <w:tcPr>
-            <w:tcW w:w="2029" w:type="dxa"/>
-          </w:tcPr>
+              <w:t>-Repository link</w:t>
+            </w:r>
+          </w:p>
           <w:p>
             <w:pPr>
               <w:cnfStyle w:val="000000000000" w:firstRow="0" w:lastRow="0" w:firstColumn="0" w:lastColumn="0" w:oddVBand="0" w:evenVBand="0" w:oddHBand="0" w:evenHBand="0" w:firstRowFirstColumn="0" w:firstRowLastColumn="0" w:lastRowFirstColumn="0" w:lastRowLastColumn="0"/>
@@ -3209,7 +3331,7 @@
                 <w:szCs w:val="22"/>
                 <w:lang w:val="en-US"/>
               </w:rPr>
-              <w:t>-Repository link</w:t>
+              <w:t>- Java Program</w:t>
             </w:r>
           </w:p>
         </w:tc>
@@ -3237,7 +3359,7 @@
                 <w:szCs w:val="22"/>
                 <w:lang w:val="en-US"/>
               </w:rPr>
-              <w:t>Prepare the presentation showcasing the results.</w:t>
+              <w:t>Create a class to convert files.</w:t>
             </w:r>
           </w:p>
         </w:tc>
@@ -3260,7 +3382,7 @@
                 <w:szCs w:val="22"/>
                 <w:lang w:val="en-US"/>
               </w:rPr>
-              <w:t>-Take evidence of all the deliverables</w:t>
+              <w:t>-Stablish the main class for the program.</w:t>
             </w:r>
           </w:p>
           <w:p>
@@ -3278,7 +3400,25 @@
                 <w:szCs w:val="22"/>
                 <w:lang w:val="en-US"/>
               </w:rPr>
-              <w:t>-Prepare descriptions for every evidence taken</w:t>
+              <w:t>-Call both classes methods.</w:t>
+            </w:r>
+          </w:p>
+          <w:p>
+            <w:pPr>
+              <w:cnfStyle w:val="000000100000" w:firstRow="0" w:lastRow="0" w:firstColumn="0" w:lastColumn="0" w:oddVBand="0" w:evenVBand="0" w:oddHBand="1" w:evenHBand="0" w:firstRowFirstColumn="0" w:firstRowLastColumn="0" w:lastRowFirstColumn="0" w:lastRowLastColumn="0"/>
+              <w:rPr>
+                <w:sz w:val="22"/>
+                <w:szCs w:val="22"/>
+                <w:lang w:val="en-US"/>
+              </w:rPr>
+            </w:pPr>
+            <w:r>
+              <w:rPr>
+                <w:sz w:val="22"/>
+                <w:szCs w:val="22"/>
+                <w:lang w:val="en-US"/>
+              </w:rPr>
+              <w:t>-Stablish inputs and outputs to handle the program.</w:t>
             </w:r>
           </w:p>
         </w:tc>
@@ -3301,7 +3441,7 @@
                 <w:szCs w:val="22"/>
                 <w:lang w:val="en-US"/>
               </w:rPr>
-              <w:t>09/28/2025 (3 days)</w:t>
+              <w:t>09/25/2025 (4 days)</w:t>
             </w:r>
           </w:p>
         </w:tc>
@@ -3324,7 +3464,25 @@
                 <w:szCs w:val="22"/>
                 <w:lang w:val="en-US"/>
               </w:rPr>
-              <w:t>-Presentation in PowerPoint</w:t>
+              <w:t>-Repository link</w:t>
+            </w:r>
+          </w:p>
+          <w:p>
+            <w:pPr>
+              <w:cnfStyle w:val="000000100000" w:firstRow="0" w:lastRow="0" w:firstColumn="0" w:lastColumn="0" w:oddVBand="0" w:evenVBand="0" w:oddHBand="1" w:evenHBand="0" w:firstRowFirstColumn="0" w:firstRowLastColumn="0" w:lastRowFirstColumn="0" w:lastRowLastColumn="0"/>
+              <w:rPr>
+                <w:sz w:val="22"/>
+                <w:szCs w:val="22"/>
+                <w:lang w:val="en-US"/>
+              </w:rPr>
+            </w:pPr>
+            <w:r>
+              <w:rPr>
+                <w:sz w:val="22"/>
+                <w:szCs w:val="22"/>
+                <w:lang w:val="en-US"/>
+              </w:rPr>
+              <w:t>- Java Program</w:t>
             </w:r>
           </w:p>
         </w:tc>
@@ -3349,6 +3507,121 @@
                 <w:szCs w:val="22"/>
                 <w:lang w:val="en-US"/>
               </w:rPr>
+              <w:t>Prepare the presentation showcasing the results.</w:t>
+            </w:r>
+          </w:p>
+        </w:tc>
+        <w:tc>
+          <w:tcPr>
+            <w:tcW w:w="2207" w:type="dxa"/>
+          </w:tcPr>
+          <w:p>
+            <w:pPr>
+              <w:cnfStyle w:val="000000000000" w:firstRow="0" w:lastRow="0" w:firstColumn="0" w:lastColumn="0" w:oddVBand="0" w:evenVBand="0" w:oddHBand="0" w:evenHBand="0" w:firstRowFirstColumn="0" w:firstRowLastColumn="0" w:lastRowFirstColumn="0" w:lastRowLastColumn="0"/>
+              <w:rPr>
+                <w:sz w:val="22"/>
+                <w:szCs w:val="22"/>
+                <w:lang w:val="en-US"/>
+              </w:rPr>
+            </w:pPr>
+            <w:r>
+              <w:rPr>
+                <w:sz w:val="22"/>
+                <w:szCs w:val="22"/>
+                <w:lang w:val="en-US"/>
+              </w:rPr>
+              <w:t>-Take evidence of all the deliverables</w:t>
+            </w:r>
+          </w:p>
+          <w:p>
+            <w:pPr>
+              <w:cnfStyle w:val="000000000000" w:firstRow="0" w:lastRow="0" w:firstColumn="0" w:lastColumn="0" w:oddVBand="0" w:evenVBand="0" w:oddHBand="0" w:evenHBand="0" w:firstRowFirstColumn="0" w:firstRowLastColumn="0" w:lastRowFirstColumn="0" w:lastRowLastColumn="0"/>
+              <w:rPr>
+                <w:sz w:val="22"/>
+                <w:szCs w:val="22"/>
+                <w:lang w:val="en-US"/>
+              </w:rPr>
+            </w:pPr>
+            <w:r>
+              <w:rPr>
+                <w:sz w:val="22"/>
+                <w:szCs w:val="22"/>
+                <w:lang w:val="en-US"/>
+              </w:rPr>
+              <w:t>-Prepare descriptions for every evidence taken</w:t>
+            </w:r>
+          </w:p>
+        </w:tc>
+        <w:tc>
+          <w:tcPr>
+            <w:tcW w:w="2385" w:type="dxa"/>
+          </w:tcPr>
+          <w:p>
+            <w:pPr>
+              <w:cnfStyle w:val="000000000000" w:firstRow="0" w:lastRow="0" w:firstColumn="0" w:lastColumn="0" w:oddVBand="0" w:evenVBand="0" w:oddHBand="0" w:evenHBand="0" w:firstRowFirstColumn="0" w:firstRowLastColumn="0" w:lastRowFirstColumn="0" w:lastRowLastColumn="0"/>
+              <w:rPr>
+                <w:sz w:val="22"/>
+                <w:szCs w:val="22"/>
+                <w:lang w:val="en-US"/>
+              </w:rPr>
+            </w:pPr>
+            <w:r>
+              <w:rPr>
+                <w:sz w:val="22"/>
+                <w:szCs w:val="22"/>
+                <w:lang w:val="en-US"/>
+              </w:rPr>
+              <w:t>09/28/2025 (3 days)</w:t>
+            </w:r>
+          </w:p>
+        </w:tc>
+        <w:tc>
+          <w:tcPr>
+            <w:tcW w:w="2029" w:type="dxa"/>
+          </w:tcPr>
+          <w:p>
+            <w:pPr>
+              <w:cnfStyle w:val="000000000000" w:firstRow="0" w:lastRow="0" w:firstColumn="0" w:lastColumn="0" w:oddVBand="0" w:evenVBand="0" w:oddHBand="0" w:evenHBand="0" w:firstRowFirstColumn="0" w:firstRowLastColumn="0" w:lastRowFirstColumn="0" w:lastRowLastColumn="0"/>
+              <w:rPr>
+                <w:sz w:val="22"/>
+                <w:szCs w:val="22"/>
+                <w:lang w:val="en-US"/>
+              </w:rPr>
+            </w:pPr>
+            <w:r>
+              <w:rPr>
+                <w:sz w:val="22"/>
+                <w:szCs w:val="22"/>
+                <w:lang w:val="en-US"/>
+              </w:rPr>
+              <w:t>-Presentation in PowerPoint</w:t>
+            </w:r>
+          </w:p>
+        </w:tc>
+      </w:tr>
+      <w:tr>
+        <w:trPr>
+          <w:cnfStyle w:val="000000100000" w:firstRow="0" w:lastRow="0" w:firstColumn="0" w:lastColumn="0" w:oddVBand="0" w:evenVBand="0" w:oddHBand="1" w:evenHBand="0" w:firstRowFirstColumn="0" w:firstRowLastColumn="0" w:lastRowFirstColumn="0" w:lastRowLastColumn="0"/>
+        </w:trPr>
+        <w:tc>
+          <w:tcPr>
+            <w:cnfStyle w:val="001000000000" w:firstRow="0" w:lastRow="0" w:firstColumn="1" w:lastColumn="0" w:oddVBand="0" w:evenVBand="0" w:oddHBand="0" w:evenHBand="0" w:firstRowFirstColumn="0" w:firstRowLastColumn="0" w:lastRowFirstColumn="0" w:lastRowLastColumn="0"/>
+            <w:tcW w:w="2207" w:type="dxa"/>
+          </w:tcPr>
+          <w:p>
+            <w:pPr>
+              <w:rPr>
+                <w:sz w:val="22"/>
+                <w:szCs w:val="22"/>
+                <w:lang w:val="en-US"/>
+              </w:rPr>
+            </w:pPr>
+            <w:r>
+              <w:rPr>
+                <w:sz w:val="22"/>
+                <w:szCs w:val="22"/>
+                <w:lang w:val="en-US"/>
+              </w:rPr>
               <w:t>Prepare a videography of results.</w:t>
             </w:r>
           </w:p>
@@ -3359,7 +3632,7 @@
           </w:tcPr>
           <w:p>
             <w:pPr>
-              <w:cnfStyle w:val="000000000000" w:firstRow="0" w:lastRow="0" w:firstColumn="0" w:lastColumn="0" w:oddVBand="0" w:evenVBand="0" w:oddHBand="0" w:evenHBand="0" w:firstRowFirstColumn="0" w:firstRowLastColumn="0" w:lastRowFirstColumn="0" w:lastRowLastColumn="0"/>
+              <w:cnfStyle w:val="000000100000" w:firstRow="0" w:lastRow="0" w:firstColumn="0" w:lastColumn="0" w:oddVBand="0" w:evenVBand="0" w:oddHBand="1" w:evenHBand="0" w:firstRowFirstColumn="0" w:firstRowLastColumn="0" w:lastRowFirstColumn="0" w:lastRowLastColumn="0"/>
               <w:rPr>
                 <w:sz w:val="22"/>
                 <w:szCs w:val="22"/>
@@ -3377,7 +3650,7 @@
           </w:p>
           <w:p>
             <w:pPr>
-              <w:cnfStyle w:val="000000000000" w:firstRow="0" w:lastRow="0" w:firstColumn="0" w:lastColumn="0" w:oddVBand="0" w:evenVBand="0" w:oddHBand="0" w:evenHBand="0" w:firstRowFirstColumn="0" w:firstRowLastColumn="0" w:lastRowFirstColumn="0" w:lastRowLastColumn="0"/>
+              <w:cnfStyle w:val="000000100000" w:firstRow="0" w:lastRow="0" w:firstColumn="0" w:lastColumn="0" w:oddVBand="0" w:evenVBand="0" w:oddHBand="1" w:evenHBand="0" w:firstRowFirstColumn="0" w:firstRowLastColumn="0" w:lastRowFirstColumn="0" w:lastRowLastColumn="0"/>
               <w:rPr>
                 <w:sz w:val="22"/>
                 <w:szCs w:val="22"/>
@@ -3395,7 +3668,7 @@
           </w:p>
           <w:p>
             <w:pPr>
-              <w:cnfStyle w:val="000000000000" w:firstRow="0" w:lastRow="0" w:firstColumn="0" w:lastColumn="0" w:oddVBand="0" w:evenVBand="0" w:oddHBand="0" w:evenHBand="0" w:firstRowFirstColumn="0" w:firstRowLastColumn="0" w:lastRowFirstColumn="0" w:lastRowLastColumn="0"/>
+              <w:cnfStyle w:val="000000100000" w:firstRow="0" w:lastRow="0" w:firstColumn="0" w:lastColumn="0" w:oddVBand="0" w:evenVBand="0" w:oddHBand="1" w:evenHBand="0" w:firstRowFirstColumn="0" w:firstRowLastColumn="0" w:lastRowFirstColumn="0" w:lastRowLastColumn="0"/>
               <w:rPr>
                 <w:sz w:val="22"/>
                 <w:szCs w:val="22"/>
@@ -3413,7 +3686,7 @@
           </w:p>
           <w:p>
             <w:pPr>
-              <w:cnfStyle w:val="000000000000" w:firstRow="0" w:lastRow="0" w:firstColumn="0" w:lastColumn="0" w:oddVBand="0" w:evenVBand="0" w:oddHBand="0" w:evenHBand="0" w:firstRowFirstColumn="0" w:firstRowLastColumn="0" w:lastRowFirstColumn="0" w:lastRowLastColumn="0"/>
+              <w:cnfStyle w:val="000000100000" w:firstRow="0" w:lastRow="0" w:firstColumn="0" w:lastColumn="0" w:oddVBand="0" w:evenVBand="0" w:oddHBand="1" w:evenHBand="0" w:firstRowFirstColumn="0" w:firstRowLastColumn="0" w:lastRowFirstColumn="0" w:lastRowLastColumn="0"/>
               <w:rPr>
                 <w:sz w:val="22"/>
                 <w:szCs w:val="22"/>
@@ -3436,7 +3709,7 @@
           </w:tcPr>
           <w:p>
             <w:pPr>
-              <w:cnfStyle w:val="000000000000" w:firstRow="0" w:lastRow="0" w:firstColumn="0" w:lastColumn="0" w:oddVBand="0" w:evenVBand="0" w:oddHBand="0" w:evenHBand="0" w:firstRowFirstColumn="0" w:firstRowLastColumn="0" w:lastRowFirstColumn="0" w:lastRowLastColumn="0"/>
+              <w:cnfStyle w:val="000000100000" w:firstRow="0" w:lastRow="0" w:firstColumn="0" w:lastColumn="0" w:oddVBand="0" w:evenVBand="0" w:oddHBand="1" w:evenHBand="0" w:firstRowFirstColumn="0" w:firstRowLastColumn="0" w:lastRowFirstColumn="0" w:lastRowLastColumn="0"/>
               <w:rPr>
                 <w:sz w:val="22"/>
                 <w:szCs w:val="22"/>
@@ -3459,7 +3732,7 @@
           </w:tcPr>
           <w:p>
             <w:pPr>
-              <w:cnfStyle w:val="000000000000" w:firstRow="0" w:lastRow="0" w:firstColumn="0" w:lastColumn="0" w:oddVBand="0" w:evenVBand="0" w:oddHBand="0" w:evenHBand="0" w:firstRowFirstColumn="0" w:firstRowLastColumn="0" w:lastRowFirstColumn="0" w:lastRowLastColumn="0"/>
+              <w:cnfStyle w:val="000000100000" w:firstRow="0" w:lastRow="0" w:firstColumn="0" w:lastColumn="0" w:oddVBand="0" w:evenVBand="0" w:oddHBand="1" w:evenHBand="0" w:firstRowFirstColumn="0" w:firstRowLastColumn="0" w:lastRowFirstColumn="0" w:lastRowLastColumn="0"/>
               <w:rPr>
                 <w:sz w:val="22"/>
                 <w:szCs w:val="22"/>
@@ -3478,34 +3751,6 @@
         </w:tc>
       </w:tr>
     </w:tbl>
-    <w:p>
-      <w:pPr>
-        <w:rPr>
-          <w:lang w:val="es-ES_tradnl"/>
-        </w:rPr>
-      </w:pPr>
-    </w:p>
-    <w:p>
-      <w:pPr>
-        <w:rPr>
-          <w:lang w:val="es-ES_tradnl"/>
-        </w:rPr>
-      </w:pPr>
-    </w:p>
-    <w:p>
-      <w:pPr>
-        <w:rPr>
-          <w:lang w:val="es-ES_tradnl"/>
-        </w:rPr>
-      </w:pPr>
-    </w:p>
-    <w:p>
-      <w:pPr>
-        <w:rPr>
-          <w:lang w:val="es-ES_tradnl"/>
-        </w:rPr>
-      </w:pPr>
-    </w:p>
     <w:p>
       <w:pPr>
         <w:rPr>

</xml_diff>